<commit_message>
Refresh Word pitch script for easy open in Word.
Regenerates script-casa-dos-paes-pitch.docx with full plain-language
narrative, slide lines, checks, avoid list, and objections for Nilda.

Co-authored-by: sarapizzico-hue <sarapizzico-hue@users.noreply.github.com>
</commit_message>
<xml_diff>
--- a/script-casa-dos-paes-pitch.docx
+++ b/script-casa-dos-paes-pitch.docx
@@ -3,357 +3,2294 @@
 <w:document xmlns:wpc="http://schemas.microsoft.com/office/word/2010/wordprocessingCanvas" xmlns:mo="http://schemas.microsoft.com/office/mac/office/2008/main" xmlns:mc="http://schemas.openxmlformats.org/markup-compatibility/2006" xmlns:mv="urn:schemas-microsoft-com:mac:vml" xmlns:o="urn:schemas-microsoft-com:office:office" xmlns:r="http://schemas.openxmlformats.org/officeDocument/2006/relationships" xmlns:m="http://schemas.openxmlformats.org/officeDocument/2006/math" xmlns:v="urn:schemas-microsoft-com:vml" xmlns:wp14="http://schemas.microsoft.com/office/word/2010/wordprocessingDrawing" xmlns:wp="http://schemas.openxmlformats.org/drawingml/2006/wordprocessingDrawing" xmlns:w10="urn:schemas-microsoft-com:office:word" xmlns:w="http://schemas.openxmlformats.org/wordprocessingml/2006/main" xmlns:w14="http://schemas.microsoft.com/office/word/2010/wordml" xmlns:wpg="http://schemas.microsoft.com/office/word/2010/wordprocessingGroup" xmlns:wpi="http://schemas.microsoft.com/office/word/2010/wordprocessingInk" xmlns:wne="http://schemas.microsoft.com/office/word/2006/wordml" xmlns:wps="http://schemas.microsoft.com/office/word/2010/wordprocessingShape" mc:Ignorable="w14 wp14">
   <w:body>
     <w:p>
+      <w:pPr>
+        <w:spacing w:after="120"/>
+      </w:pPr>
       <w:r>
         <w:rPr>
           <w:rFonts w:ascii="Calibri" w:hAnsi="Calibri" w:eastAsia="Calibri"/>
           <w:b/>
-          <w:color w:val="141414"/>
-          <w:sz w:val="32"/>
+          <w:i w:val="0"/>
+          <w:color w:val="B4141E"/>
+          <w:sz w:val="48"/>
         </w:rPr>
-        <w:t>SCRIPT + NARRATIVA · CASA DOS PÃES</w:t>
+        <w:t>Script de Pitch · Casa dos Pães</w:t>
       </w:r>
     </w:p>
     <w:p>
+      <w:pPr>
+        <w:spacing w:after="160"/>
+      </w:pPr>
+      <w:r>
+        <w:rPr>
+          <w:rFonts w:ascii="Calibri" w:hAnsi="Calibri" w:eastAsia="Calibri"/>
+          <w:b w:val="0"/>
+          <w:i w:val="0"/>
+          <w:color w:val="646464"/>
+          <w:sz w:val="22"/>
+        </w:rPr>
+        <w:t>Narrativa + fala slide a slide · linguagem simples para Nilda (cliente leiga)</w:t>
+        <w:br/>
+        <w:t>Uso interno V4 · não enviar à cliente · acompanha o deck de 10 slides</w:t>
+      </w:r>
+    </w:p>
+    <w:p>
+      <w:pPr>
+        <w:spacing w:after="80" w:line="324" w:lineRule="auto"/>
+      </w:pPr>
+      <w:r>
+        <w:rPr>
+          <w:rFonts w:ascii="Calibri" w:hAnsi="Calibri" w:eastAsia="Calibri"/>
+          <w:b/>
+          <w:i w:val="0"/>
+          <w:color w:val="1E1E1E"/>
+          <w:sz w:val="22"/>
+        </w:rPr>
+        <w:t>Fio da conversa: cliente já chega → ninguém segura → organizamos o WhatsApp em 90 dias → ela sai do aperto. Preço só no fim. Meta de R$ 500 mil é dela, não promessa deste projeto.</w:t>
+      </w:r>
+    </w:p>
+    <w:p>
+      <w:pPr>
+        <w:spacing w:after="120" w:line="336" w:lineRule="auto"/>
+        <w:ind w:left="227"/>
+      </w:pPr>
       <w:r>
         <w:rPr>
           <w:rFonts w:ascii="Calibri" w:hAnsi="Calibri" w:eastAsia="Calibri"/>
           <w:b w:val="0"/>
           <w:i/>
+          <w:color w:val="282828"/>
           <w:sz w:val="22"/>
         </w:rPr>
-        <w:t>Cliente: Nilda (bem leiga) · Deck 10 slides · Uso interno V4</w:t>
+        <w:t>“Nilda, o problema não é falta de cliente batendo. É o WhatsApp sem dono quando você está na rua — e a gente veio organizar isso.”</w:t>
       </w:r>
     </w:p>
     <w:p>
+      <w:pPr>
+        <w:spacing w:before="160" w:after="160"/>
+        <w:pBdr>
+          <w:bottom w:val="single" w:sz="6" w:space="1" w:color="C9C9C9"/>
+        </w:pBdr>
+      </w:pPr>
+    </w:p>
+    <w:p>
+      <w:pPr>
+        <w:spacing w:after="120"/>
+      </w:pPr>
+      <w:r>
+        <w:rPr>
+          <w:rFonts w:ascii="Calibri" w:hAnsi="Calibri" w:eastAsia="Calibri"/>
+          <w:b/>
+          <w:i w:val="0"/>
+          <w:color w:val="B4141E"/>
+          <w:sz w:val="32"/>
+        </w:rPr>
+        <w:t>Regras de tom</w:t>
+      </w:r>
+    </w:p>
+    <w:p>
+      <w:pPr>
+        <w:pStyle w:val="ListBullet"/>
+        <w:spacing w:after="40"/>
+      </w:pPr>
       <w:r>
         <w:rPr>
           <w:rFonts w:ascii="Calibri" w:hAnsi="Calibri" w:eastAsia="Calibri"/>
           <w:b w:val="0"/>
           <w:i w:val="0"/>
-          <w:sz w:val="22"/>
+          <w:color w:val="323232"/>
+          <w:sz w:val="21"/>
         </w:rPr>
-        <w:t>Fio: cliente já chega → WhatsApp sem dono quando ela está na rua → organizar em 90 dias → ela sai do aperto. Preço no fim. R$ 500 mil é meta dela, não promessa.</w:t>
+        <w:t>Nunca diga CRM, SDR, 3P-IA, SLA, LP, Kommo, handoff sem traduzir.</w:t>
       </w:r>
     </w:p>
     <w:p>
+      <w:pPr>
+        <w:pStyle w:val="ListBullet"/>
+        <w:spacing w:after="40"/>
+      </w:pPr>
       <w:r>
         <w:rPr>
           <w:rFonts w:ascii="Calibri" w:hAnsi="Calibri" w:eastAsia="Calibri"/>
           <w:b w:val="0"/>
           <w:i w:val="0"/>
-          <w:sz w:val="22"/>
+          <w:color w:val="323232"/>
+          <w:sz w:val="21"/>
         </w:rPr>
-        <w:t>Regra de linguagem: sem CRM/SDR/3P-IA/SLA/LP/Kommo sem traduzir. Fale cadastro, ajudante no zap, passo a passo, tempo de resposta, página.</w:t>
+        <w:t>Troque por: cadastro de clientes, ajudante automático, passo a passo, tempo de resposta, página, sistema organizado.</w:t>
       </w:r>
     </w:p>
     <w:p>
-      <w:r>
-        <w:rPr>
-          <w:rFonts w:ascii="Calibri" w:hAnsi="Calibri" w:eastAsia="Calibri"/>
-          <w:b/>
-          <w:color w:val="B40A14"/>
-          <w:sz w:val="26"/>
-        </w:rPr>
-        <w:t>Antes da tela</w:t>
-      </w:r>
-    </w:p>
-    <w:p>
+      <w:pPr>
+        <w:pStyle w:val="ListBullet"/>
+        <w:spacing w:after="40"/>
+      </w:pPr>
       <w:r>
         <w:rPr>
           <w:rFonts w:ascii="Calibri" w:hAnsi="Calibri" w:eastAsia="Calibri"/>
           <w:b w:val="0"/>
           <w:i w:val="0"/>
-          <w:sz w:val="22"/>
+          <w:color w:val="323232"/>
+          <w:sz w:val="21"/>
         </w:rPr>
-        <w:t>“Como está a rotina essa semana? Quando o cliente manda mensagem e você está na rua… o que acontece?”</w:t>
+        <w:t>Não falar: escalar mídia agora · “máquina de vendas” · R$ 500 mil garantido · jargão de agência.</w:t>
       </w:r>
     </w:p>
     <w:p>
-      <w:r>
-        <w:rPr>
-          <w:rFonts w:ascii="Calibri" w:hAnsi="Calibri" w:eastAsia="Calibri"/>
-          <w:b/>
-          <w:color w:val="B40A14"/>
-          <w:sz w:val="26"/>
-        </w:rPr>
-        <w:t>01 Capa</w:t>
-      </w:r>
-    </w:p>
-    <w:p>
+      <w:pPr>
+        <w:pStyle w:val="ListBullet"/>
+        <w:spacing w:after="40"/>
+      </w:pPr>
       <w:r>
         <w:rPr>
           <w:rFonts w:ascii="Calibri" w:hAnsi="Calibri" w:eastAsia="Calibri"/>
           <w:b w:val="0"/>
           <w:i w:val="0"/>
-          <w:sz w:val="22"/>
+          <w:color w:val="323232"/>
+          <w:sz w:val="21"/>
         </w:rPr>
-        <w:t>“O cliente já chega. O que a gente veio resolver não é aparecer mais — é, quando chega, não escapar.”</w:t>
+        <w:t>Ela quer ouvir: “alguém vai atender no meu lugar”, “fica organizado”, “eu consigo acompanhar”.</w:t>
       </w:r>
     </w:p>
     <w:p>
+      <w:pPr>
+        <w:spacing w:before="160" w:after="160"/>
+        <w:pBdr>
+          <w:bottom w:val="single" w:sz="6" w:space="1" w:color="C9C9C9"/>
+        </w:pBdr>
+      </w:pPr>
+    </w:p>
+    <w:p>
+      <w:pPr>
+        <w:spacing w:after="120"/>
+      </w:pPr>
       <w:r>
         <w:rPr>
           <w:rFonts w:ascii="Calibri" w:hAnsi="Calibri" w:eastAsia="Calibri"/>
           <w:b/>
-          <w:color w:val="B40A14"/>
-          <w:sz w:val="26"/>
+          <w:i w:val="0"/>
+          <w:color w:val="B4141E"/>
+          <w:sz w:val="32"/>
         </w:rPr>
-        <w:t>02 Gargalo</w:t>
+        <w:t>Perfil rápido</w:t>
       </w:r>
     </w:p>
     <w:p>
+      <w:pPr>
+        <w:spacing w:after="80" w:line="324" w:lineRule="auto"/>
+      </w:pPr>
       <w:r>
         <w:rPr>
           <w:rFonts w:ascii="Calibri" w:hAnsi="Calibri" w:eastAsia="Calibri"/>
           <w:b w:val="0"/>
           <w:i w:val="0"/>
+          <w:color w:val="1E1E1E"/>
           <w:sz w:val="22"/>
         </w:rPr>
-        <w:t>“Não é preço. Compras, atendimento e divulgação batem em você. O zap toca, você está na rua, o cliente some. A gente organiza a casa — não joga anúncio de novo.”</w:t>
+        <w:t>Como ela pensa: medo de gastar de novo; quer resultado rápido; confunde agência com “coloca anúncio no ar”.</w:t>
       </w:r>
     </w:p>
     <w:p>
-      <w:r>
-        <w:rPr>
-          <w:rFonts w:ascii="Calibri" w:hAnsi="Calibri" w:eastAsia="Calibri"/>
-          <w:b/>
-          <w:color w:val="B40A14"/>
-          <w:sz w:val="26"/>
-        </w:rPr>
-        <w:t>03 Ordem certa</w:t>
-      </w:r>
-    </w:p>
-    <w:p>
+      <w:pPr>
+        <w:spacing w:after="80" w:line="324" w:lineRule="auto"/>
+      </w:pPr>
       <w:r>
         <w:rPr>
           <w:rFonts w:ascii="Calibri" w:hAnsi="Calibri" w:eastAsia="Calibri"/>
           <w:b w:val="0"/>
           <w:i w:val="0"/>
+          <w:color w:val="1E1E1E"/>
           <w:sz w:val="22"/>
         </w:rPr>
-        <w:t>“Organizar → atender → anotar quem é o cliente → fazer voltar. Sem isso, divulgação gira em círculo.”</w:t>
+        <w:t>O que ela sente: cansaço; tudo depende dela; culpa quando o cliente chama e não tem resposta.</w:t>
       </w:r>
     </w:p>
     <w:p>
+      <w:pPr>
+        <w:spacing w:before="160" w:after="160"/>
+        <w:pBdr>
+          <w:bottom w:val="single" w:sz="6" w:space="1" w:color="C9C9C9"/>
+        </w:pBdr>
+      </w:pPr>
+    </w:p>
+    <w:p>
+      <w:pPr>
+        <w:spacing w:before="200" w:after="40"/>
+      </w:pPr>
       <w:r>
         <w:rPr>
           <w:rFonts w:ascii="Calibri" w:hAnsi="Calibri" w:eastAsia="Calibri"/>
           <w:b/>
-          <w:color w:val="B40A14"/>
-          <w:sz w:val="26"/>
+          <w:i w:val="0"/>
+          <w:color w:val="B4141E"/>
+          <w:sz w:val="18"/>
         </w:rPr>
-        <w:t>04 90 dias (promessa)</w:t>
+        <w:t>BLOCO 0 · ANTES DA TELA (~1 MIN)</w:t>
       </w:r>
     </w:p>
     <w:p>
+      <w:pPr>
+        <w:spacing w:after="120"/>
+      </w:pPr>
+      <w:r>
+        <w:rPr>
+          <w:rFonts w:ascii="Calibri" w:hAnsi="Calibri" w:eastAsia="Calibri"/>
+          <w:b/>
+          <w:i w:val="0"/>
+          <w:color w:val="191919"/>
+          <w:sz w:val="28"/>
+        </w:rPr>
+        <w:t>Abrir clima · escutar</w:t>
+      </w:r>
+    </w:p>
+    <w:p>
+      <w:pPr>
+        <w:spacing w:before="80" w:after="80"/>
+      </w:pPr>
+      <w:r>
+        <w:rPr>
+          <w:rFonts w:ascii="Calibri" w:hAnsi="Calibri" w:eastAsia="Calibri"/>
+          <w:b/>
+          <w:i w:val="0"/>
+          <w:color w:val="B4141E"/>
+          <w:sz w:val="20"/>
+        </w:rPr>
+        <w:t xml:space="preserve">Objetivo: </w:t>
+      </w:r>
       <w:r>
         <w:rPr>
           <w:rFonts w:ascii="Calibri" w:hAnsi="Calibri" w:eastAsia="Calibri"/>
           <w:b w:val="0"/>
           <w:i w:val="0"/>
-          <w:sz w:val="22"/>
+          <w:color w:val="3C3C3C"/>
+          <w:sz w:val="20"/>
         </w:rPr>
-        <w:t>“Em três meses isso funciona na prática: zap organizado, pessoa treinada, resposta mesmo com você na rua, jeito de acompanhar quem chamou. Não é papel bonito — é rotina.”</w:t>
+        <w:t>Ela falar. Você escuta. Zero monólogo, zero preço.</w:t>
       </w:r>
     </w:p>
     <w:p>
+      <w:pPr>
+        <w:spacing w:before="200" w:after="40"/>
+      </w:pPr>
       <w:r>
         <w:rPr>
           <w:rFonts w:ascii="Calibri" w:hAnsi="Calibri" w:eastAsia="Calibri"/>
           <w:b/>
-          <w:color w:val="B40A14"/>
-          <w:sz w:val="26"/>
+          <w:i w:val="0"/>
+          <w:color w:val="646464"/>
+          <w:sz w:val="18"/>
         </w:rPr>
-        <w:t>05 Capacidades</w:t>
+        <w:t>FALA</w:t>
       </w:r>
     </w:p>
     <w:p>
+      <w:pPr>
+        <w:spacing w:after="120" w:line="336" w:lineRule="auto"/>
+        <w:ind w:left="227"/>
+      </w:pPr>
+      <w:r>
+        <w:rPr>
+          <w:rFonts w:ascii="Calibri" w:hAnsi="Calibri" w:eastAsia="Calibri"/>
+          <w:b w:val="0"/>
+          <w:i/>
+          <w:color w:val="282828"/>
+          <w:sz w:val="22"/>
+        </w:rPr>
+        <w:t>“Nilda, antes de eu abrir a tela: como está a rotina aí na loja essa semana? Compra, atendimento, WhatsApp — o que mais tem te puxado?”</w:t>
+      </w:r>
+    </w:p>
+    <w:p>
+      <w:pPr>
+        <w:spacing w:before="200" w:after="40"/>
+      </w:pPr>
+      <w:r>
+        <w:rPr>
+          <w:rFonts w:ascii="Calibri" w:hAnsi="Calibri" w:eastAsia="Calibri"/>
+          <w:b/>
+          <w:i w:val="0"/>
+          <w:color w:val="646464"/>
+          <w:sz w:val="18"/>
+        </w:rPr>
+        <w:t>NA CABEÇA, SEM FALAR</w:t>
+      </w:r>
+    </w:p>
+    <w:p>
+      <w:pPr>
+        <w:pStyle w:val="ListBullet"/>
+        <w:spacing w:after="40"/>
+      </w:pPr>
       <w:r>
         <w:rPr>
           <w:rFonts w:ascii="Calibri" w:hAnsi="Calibri" w:eastAsia="Calibri"/>
           <w:b w:val="0"/>
           <w:i w:val="0"/>
-          <w:sz w:val="22"/>
+          <w:color w:val="323232"/>
+          <w:sz w:val="21"/>
         </w:rPr>
-        <w:t>Traduzir: Google/Instagram com botão; catálogo+PIX; roteiro; alguém no posto; cadastro; resposta fora do horário que passa pra gente.</w:t>
+        <w:t>Ela espera “anúncio e filmagem”. Você veio organizar a casa.</w:t>
       </w:r>
     </w:p>
     <w:p>
-      <w:r>
-        <w:rPr>
-          <w:rFonts w:ascii="Calibri" w:hAnsi="Calibri" w:eastAsia="Calibri"/>
-          <w:b/>
-          <w:color w:val="B40A14"/>
-          <w:sz w:val="26"/>
-        </w:rPr>
-        <w:t>06 Método</w:t>
-      </w:r>
-    </w:p>
-    <w:p>
+      <w:pPr>
+        <w:pStyle w:val="ListBullet"/>
+        <w:spacing w:after="40"/>
+      </w:pPr>
       <w:r>
         <w:rPr>
           <w:rFonts w:ascii="Calibri" w:hAnsi="Calibri" w:eastAsia="Calibri"/>
           <w:b w:val="0"/>
           <w:i w:val="0"/>
-          <w:sz w:val="22"/>
+          <w:color w:val="323232"/>
+          <w:sz w:val="21"/>
         </w:rPr>
-        <w:t>“Igual receita de bolo: produto/preço → jeito de atender → pessoa → só depois ajudante automático. Robô em bagunça = bagunça automática.”</w:t>
+        <w:t>Validar dor: mensagem sem resposta quando ela está comprando.</w:t>
       </w:r>
     </w:p>
     <w:p>
-      <w:r>
-        <w:rPr>
-          <w:rFonts w:ascii="Calibri" w:hAnsi="Calibri" w:eastAsia="Calibri"/>
-          <w:b/>
-          <w:color w:val="B40A14"/>
-          <w:sz w:val="26"/>
-        </w:rPr>
-        <w:t>07 Calendário</w:t>
-      </w:r>
-    </w:p>
-    <w:p>
+      <w:pPr>
+        <w:pStyle w:val="ListBullet"/>
+        <w:spacing w:after="40"/>
+      </w:pPr>
       <w:r>
         <w:rPr>
           <w:rFonts w:ascii="Calibri" w:hAnsi="Calibri" w:eastAsia="Calibri"/>
           <w:b w:val="0"/>
           <w:i w:val="0"/>
-          <w:sz w:val="22"/>
+          <w:color w:val="323232"/>
+          <w:sz w:val="21"/>
         </w:rPr>
-        <w:t>M1 porta de entrada + nome no caixa. M2 treino e você sai do primeiro oi. M3 ajuda automática + cliente voltar + mostrar melhora. 500k = meta da empresa; 90 dias = alicerce.</w:t>
+        <w:t>Não corrigir ainda. Só espelhar.</w:t>
       </w:r>
     </w:p>
     <w:p>
+      <w:pPr>
+        <w:spacing w:before="80" w:after="80"/>
+      </w:pPr>
       <w:r>
         <w:rPr>
           <w:rFonts w:ascii="Calibri" w:hAnsi="Calibri" w:eastAsia="Calibri"/>
           <w:b/>
-          <w:color w:val="B40A14"/>
-          <w:sz w:val="26"/>
+          <w:i w:val="0"/>
+          <w:color w:val="14508C"/>
+          <w:sz w:val="20"/>
         </w:rPr>
-        <w:t>08 O que olhamos</w:t>
+        <w:t xml:space="preserve">Pergunta / check: </w:t>
       </w:r>
-    </w:p>
-    <w:p>
       <w:r>
         <w:rPr>
           <w:rFonts w:ascii="Calibri" w:hAnsi="Calibri" w:eastAsia="Calibri"/>
           <w:b w:val="0"/>
           <w:i w:val="0"/>
-          <w:sz w:val="22"/>
+          <w:color w:val="3C3C3C"/>
+          <w:sz w:val="20"/>
         </w:rPr>
-        <w:t>Resposta rápida, menos vácuo, cadastro crescendo, remarcar quem comprou, suas horas no zap caindo.</w:t>
+        <w:t>“Quando o cliente manda mensagem e você está na rua… o que acontece hoje?”</w:t>
       </w:r>
     </w:p>
     <w:p>
+      <w:pPr>
+        <w:spacing w:before="80" w:after="80"/>
+      </w:pPr>
       <w:r>
         <w:rPr>
           <w:rFonts w:ascii="Calibri" w:hAnsi="Calibri" w:eastAsia="Calibri"/>
           <w:b/>
-          <w:color w:val="B40A14"/>
-          <w:sz w:val="26"/>
+          <w:i w:val="0"/>
+          <w:color w:val="965A00"/>
+          <w:sz w:val="20"/>
         </w:rPr>
-        <w:t>09 Encaixe</w:t>
+        <w:t xml:space="preserve">Evitar: </w:t>
       </w:r>
-    </w:p>
-    <w:p>
       <w:r>
         <w:rPr>
           <w:rFonts w:ascii="Calibri" w:hAnsi="Calibri" w:eastAsia="Calibri"/>
           <w:b w:val="0"/>
           <w:i w:val="0"/>
-          <w:sz w:val="22"/>
+          <w:color w:val="3C3C3C"/>
+          <w:sz w:val="20"/>
         </w:rPr>
-        <w:t>Dois jeitos no zap (promo e pedido). Nome no caixa. Precisa de alguém no atendimento (mesmo meio período).</w:t>
+        <w:t>abrir valor · falar de IA · falar de R$ 500 mil · dizer “você precisa de processo”.</w:t>
       </w:r>
     </w:p>
     <w:p>
+      <w:pPr>
+        <w:spacing w:before="160" w:after="160"/>
+        <w:pBdr>
+          <w:bottom w:val="single" w:sz="6" w:space="1" w:color="C9C9C9"/>
+        </w:pBdr>
+      </w:pPr>
+    </w:p>
+    <w:p>
+      <w:pPr>
+        <w:spacing w:before="200" w:after="40"/>
+      </w:pPr>
       <w:r>
         <w:rPr>
           <w:rFonts w:ascii="Calibri" w:hAnsi="Calibri" w:eastAsia="Calibri"/>
           <w:b/>
-          <w:color w:val="B40A14"/>
-          <w:sz w:val="26"/>
+          <w:i w:val="0"/>
+          <w:color w:val="B4141E"/>
+          <w:sz w:val="18"/>
         </w:rPr>
-        <w:t>10 Investimento</w:t>
+        <w:t>SLIDE 01 · CAPA (~30S)</w:t>
       </w:r>
     </w:p>
     <w:p>
+      <w:pPr>
+        <w:spacing w:after="120"/>
+      </w:pPr>
+      <w:r>
+        <w:rPr>
+          <w:rFonts w:ascii="Calibri" w:hAnsi="Calibri" w:eastAsia="Calibri"/>
+          <w:b/>
+          <w:i w:val="0"/>
+          <w:color w:val="191919"/>
+          <w:sz w:val="28"/>
+        </w:rPr>
+        <w:t>A demanda já chega. Falta a operação segurar.</w:t>
+      </w:r>
+    </w:p>
+    <w:p>
+      <w:pPr>
+        <w:spacing w:before="80" w:after="80"/>
+      </w:pPr>
+      <w:r>
+        <w:rPr>
+          <w:rFonts w:ascii="Calibri" w:hAnsi="Calibri" w:eastAsia="Calibri"/>
+          <w:b/>
+          <w:i w:val="0"/>
+          <w:color w:val="B4141E"/>
+          <w:sz w:val="20"/>
+        </w:rPr>
+        <w:t xml:space="preserve">Objetivo: </w:t>
+      </w:r>
       <w:r>
         <w:rPr>
           <w:rFonts w:ascii="Calibri" w:hAnsi="Calibri" w:eastAsia="Calibri"/>
           <w:b w:val="0"/>
           <w:i w:val="0"/>
-          <w:sz w:val="22"/>
+          <w:color w:val="3C3C3C"/>
+          <w:sz w:val="20"/>
         </w:rPr>
-        <w:t>R$ 18 mil à vista ou 12× R$ 1.666,67. Sem anúncio pago neste escopo. CTA: avançar e marcar início + indicar quem atende.</w:t>
+        <w:t>Tese em português claro. Parece conversa, não pitch de produto.</w:t>
       </w:r>
     </w:p>
     <w:p>
+      <w:pPr>
+        <w:spacing w:before="200" w:after="40"/>
+      </w:pPr>
       <w:r>
         <w:rPr>
           <w:rFonts w:ascii="Calibri" w:hAnsi="Calibri" w:eastAsia="Calibri"/>
           <w:b/>
-          <w:color w:val="B40A14"/>
-          <w:sz w:val="26"/>
+          <w:i w:val="0"/>
+          <w:color w:val="646464"/>
+          <w:sz w:val="18"/>
         </w:rPr>
-        <w:t>Objeções curtas</w:t>
+        <w:t>FALA</w:t>
       </w:r>
     </w:p>
     <w:p>
       <w:pPr>
-        <w:pStyle w:val="ListBullet"/>
+        <w:spacing w:after="120" w:line="336" w:lineRule="auto"/>
+        <w:ind w:left="227"/>
       </w:pPr>
       <w:r>
         <w:rPr>
           <w:rFonts w:ascii="Calibri" w:hAnsi="Calibri" w:eastAsia="Calibri"/>
           <w:b w:val="0"/>
+          <w:i/>
+          <w:color w:val="282828"/>
           <w:sz w:val="22"/>
         </w:rPr>
-        <w:t>Anúncio agora → “Se o zap não responde, você paga pra cliente ficar bravo. Primeiro atender.”</w:t>
+        <w:t>“Olha o título com calma: o cliente já chega. Preço bom, variedade, gente da rua e do bairro. O que a gente veio resolver não é ‘como aparecer mais’. É: quando chega, não escapar.”</w:t>
       </w:r>
     </w:p>
     <w:p>
       <w:pPr>
-        <w:pStyle w:val="ListBullet"/>
-      </w:pPr>
+        <w:spacing w:before="80" w:after="80"/>
+      </w:pPr>
+      <w:r>
+        <w:rPr>
+          <w:rFonts w:ascii="Calibri" w:hAnsi="Calibri" w:eastAsia="Calibri"/>
+          <w:b/>
+          <w:i w:val="0"/>
+          <w:color w:val="14508C"/>
+          <w:sz w:val="20"/>
+        </w:rPr>
+        <w:t xml:space="preserve">Pergunta / check: </w:t>
+      </w:r>
       <w:r>
         <w:rPr>
           <w:rFonts w:ascii="Calibri" w:hAnsi="Calibri" w:eastAsia="Calibri"/>
           <w:b w:val="0"/>
-          <w:sz w:val="22"/>
+          <w:i w:val="0"/>
+          <w:color w:val="3C3C3C"/>
+          <w:sz w:val="20"/>
         </w:rPr>
-        <w:t>Já gastei → “Faltou organização. Aqui é rotina funcionando.”</w:t>
+        <w:t>“Faz sentido pra você essa leitura — que o aperto maior hoje é segurar o que já aparece?”</w:t>
       </w:r>
     </w:p>
     <w:p>
       <w:pPr>
-        <w:pStyle w:val="ListBullet"/>
-      </w:pPr>
+        <w:spacing w:before="80" w:after="80"/>
+      </w:pPr>
+      <w:r>
+        <w:rPr>
+          <w:rFonts w:ascii="Calibri" w:hAnsi="Calibri" w:eastAsia="Calibri"/>
+          <w:b/>
+          <w:i w:val="0"/>
+          <w:color w:val="965A00"/>
+          <w:sz w:val="20"/>
+        </w:rPr>
+        <w:t xml:space="preserve">Evitar: </w:t>
+      </w:r>
       <w:r>
         <w:rPr>
           <w:rFonts w:ascii="Calibri" w:hAnsi="Calibri" w:eastAsia="Calibri"/>
           <w:b w:val="0"/>
-          <w:sz w:val="22"/>
+          <w:i w:val="0"/>
+          <w:color w:val="3C3C3C"/>
+          <w:sz w:val="20"/>
         </w:rPr>
-        <w:t>Não tenho gente → “Precisa de pelo menos uma pessoa, mesmo meio período.”</w:t>
+        <w:t>“máquina de vendas” · ZapFirst · plano base · mídia.</w:t>
       </w:r>
     </w:p>
     <w:p>
       <w:pPr>
-        <w:pStyle w:val="ListBullet"/>
-      </w:pPr>
+        <w:spacing w:before="160" w:after="160"/>
+        <w:pBdr>
+          <w:bottom w:val="single" w:sz="6" w:space="1" w:color="C9C9C9"/>
+        </w:pBdr>
+      </w:pPr>
+    </w:p>
+    <w:p>
+      <w:pPr>
+        <w:spacing w:before="200" w:after="40"/>
+      </w:pPr>
+      <w:r>
+        <w:rPr>
+          <w:rFonts w:ascii="Calibri" w:hAnsi="Calibri" w:eastAsia="Calibri"/>
+          <w:b/>
+          <w:i w:val="0"/>
+          <w:color w:val="B4141E"/>
+          <w:sz w:val="18"/>
+        </w:rPr>
+        <w:t>SLIDE 02 · O GARGALO (~1–1,5 MIN)</w:t>
+      </w:r>
+    </w:p>
+    <w:p>
+      <w:pPr>
+        <w:spacing w:after="120"/>
+      </w:pPr>
+      <w:r>
+        <w:rPr>
+          <w:rFonts w:ascii="Calibri" w:hAnsi="Calibri" w:eastAsia="Calibri"/>
+          <w:b/>
+          <w:i w:val="0"/>
+          <w:color w:val="191919"/>
+          <w:sz w:val="28"/>
+        </w:rPr>
+        <w:t>Não é preço. É tudo passando por você.</w:t>
+      </w:r>
+    </w:p>
+    <w:p>
+      <w:pPr>
+        <w:spacing w:before="80" w:after="80"/>
+      </w:pPr>
+      <w:r>
+        <w:rPr>
+          <w:rFonts w:ascii="Calibri" w:hAnsi="Calibri" w:eastAsia="Calibri"/>
+          <w:b/>
+          <w:i w:val="0"/>
+          <w:color w:val="B4141E"/>
+          <w:sz w:val="20"/>
+        </w:rPr>
+        <w:t xml:space="preserve">Objetivo: </w:t>
+      </w:r>
       <w:r>
         <w:rPr>
           <w:rFonts w:ascii="Calibri" w:hAnsi="Calibri" w:eastAsia="Calibri"/>
           <w:b w:val="0"/>
+          <w:i w:val="0"/>
+          <w:color w:val="3C3C3C"/>
+          <w:sz w:val="20"/>
+        </w:rPr>
+        <w:t>Ela se reconhecer sem se sentir atacada.</w:t>
+      </w:r>
+    </w:p>
+    <w:p>
+      <w:pPr>
+        <w:spacing w:before="200" w:after="40"/>
+      </w:pPr>
+      <w:r>
+        <w:rPr>
+          <w:rFonts w:ascii="Calibri" w:hAnsi="Calibri" w:eastAsia="Calibri"/>
+          <w:b/>
+          <w:i w:val="0"/>
+          <w:color w:val="646464"/>
+          <w:sz w:val="18"/>
+        </w:rPr>
+        <w:t>FALA</w:t>
+      </w:r>
+    </w:p>
+    <w:p>
+      <w:pPr>
+        <w:spacing w:after="120" w:line="336" w:lineRule="auto"/>
+        <w:ind w:left="227"/>
+      </w:pPr>
+      <w:r>
+        <w:rPr>
+          <w:rFonts w:ascii="Calibri" w:hAnsi="Calibri" w:eastAsia="Calibri"/>
+          <w:b w:val="0"/>
+          <w:i/>
+          <w:color w:val="282828"/>
           <w:sz w:val="22"/>
         </w:rPr>
-        <w:t>Caro → “Projeto de 3 meses pra tirar o aperto do seu colo. Olhamos o parcelado?”</w:t>
+        <w:t>“Nilda, do jeito que a gente mapeou: o supermercado tem preço. Isso já atrai. O aperto é outro — compras, atendimento e divulgação batem em você. Aí o WhatsApp toca, você está na rua… e o cliente some. Não é falta de esforço. É falta de alguém e de um jeito organizado de atender.”</w:t>
+      </w:r>
+    </w:p>
+    <w:p>
+      <w:pPr>
+        <w:spacing w:after="120" w:line="336" w:lineRule="auto"/>
+        <w:ind w:left="227"/>
+      </w:pPr>
+      <w:r>
+        <w:rPr>
+          <w:rFonts w:ascii="Calibri" w:hAnsi="Calibri" w:eastAsia="Calibri"/>
+          <w:b w:val="0"/>
+          <w:i/>
+          <w:color w:val="282828"/>
+          <w:sz w:val="22"/>
+        </w:rPr>
+        <w:t>“E tem o medo certo: já investiu antes e não viu volta. Então a gente não começa jogando dinheiro em anúncio de novo. A gente começa organizando a casa.”</w:t>
+      </w:r>
+    </w:p>
+    <w:p>
+      <w:pPr>
+        <w:spacing w:before="80" w:after="80"/>
+      </w:pPr>
+      <w:r>
+        <w:rPr>
+          <w:rFonts w:ascii="Calibri" w:hAnsi="Calibri" w:eastAsia="Calibri"/>
+          <w:b/>
+          <w:i w:val="0"/>
+          <w:color w:val="14508C"/>
+          <w:sz w:val="20"/>
+        </w:rPr>
+        <w:t xml:space="preserve">Pergunta / check: </w:t>
+      </w:r>
+      <w:r>
+        <w:rPr>
+          <w:rFonts w:ascii="Calibri" w:hAnsi="Calibri" w:eastAsia="Calibri"/>
+          <w:b w:val="0"/>
+          <w:i w:val="0"/>
+          <w:color w:val="3C3C3C"/>
+          <w:sz w:val="20"/>
+        </w:rPr>
+        <w:t>“Se amanhã o WhatsApp tocasse o dobro… quem responderia sem ser você?”</w:t>
+      </w:r>
+    </w:p>
+    <w:p>
+      <w:pPr>
+        <w:spacing w:before="80" w:after="80"/>
+      </w:pPr>
+      <w:r>
+        <w:rPr>
+          <w:rFonts w:ascii="Calibri" w:hAnsi="Calibri" w:eastAsia="Calibri"/>
+          <w:b/>
+          <w:i w:val="0"/>
+          <w:color w:val="965A00"/>
+          <w:sz w:val="20"/>
+        </w:rPr>
+        <w:t xml:space="preserve">Evitar: </w:t>
+      </w:r>
+      <w:r>
+        <w:rPr>
+          <w:rFonts w:ascii="Calibri" w:hAnsi="Calibri" w:eastAsia="Calibri"/>
+          <w:b w:val="0"/>
+          <w:i w:val="0"/>
+          <w:color w:val="3C3C3C"/>
+          <w:sz w:val="20"/>
+        </w:rPr>
+        <w:t>“você é o gargalo” · “Nilda-dependência” · tom de culpa.</w:t>
+      </w:r>
+    </w:p>
+    <w:p>
+      <w:pPr>
+        <w:spacing w:before="160" w:after="160"/>
+        <w:pBdr>
+          <w:bottom w:val="single" w:sz="6" w:space="1" w:color="C9C9C9"/>
+        </w:pBdr>
+      </w:pPr>
+    </w:p>
+    <w:p>
+      <w:pPr>
+        <w:spacing w:before="200" w:after="40"/>
+      </w:pPr>
+      <w:r>
+        <w:rPr>
+          <w:rFonts w:ascii="Calibri" w:hAnsi="Calibri" w:eastAsia="Calibri"/>
+          <w:b/>
+          <w:i w:val="0"/>
+          <w:color w:val="B4141E"/>
+          <w:sz w:val="18"/>
+        </w:rPr>
+        <w:t>SLIDE 03 · ORDEM CERTA (~45S)</w:t>
+      </w:r>
+    </w:p>
+    <w:p>
+      <w:pPr>
+        <w:spacing w:after="120"/>
+      </w:pPr>
+      <w:r>
+        <w:rPr>
+          <w:rFonts w:ascii="Calibri" w:hAnsi="Calibri" w:eastAsia="Calibri"/>
+          <w:b/>
+          <w:i w:val="0"/>
+          <w:color w:val="191919"/>
+          <w:sz w:val="28"/>
+        </w:rPr>
+        <w:t>Organizar → atender → anotar → fidelizar</w:t>
+      </w:r>
+    </w:p>
+    <w:p>
+      <w:pPr>
+        <w:spacing w:before="80" w:after="80"/>
+      </w:pPr>
+      <w:r>
+        <w:rPr>
+          <w:rFonts w:ascii="Calibri" w:hAnsi="Calibri" w:eastAsia="Calibri"/>
+          <w:b/>
+          <w:i w:val="0"/>
+          <w:color w:val="B4141E"/>
+          <w:sz w:val="20"/>
+        </w:rPr>
+        <w:t xml:space="preserve">Objetivo: </w:t>
+      </w:r>
+      <w:r>
+        <w:rPr>
+          <w:rFonts w:ascii="Calibri" w:hAnsi="Calibri" w:eastAsia="Calibri"/>
+          <w:b w:val="0"/>
+          <w:i w:val="0"/>
+          <w:color w:val="3C3C3C"/>
+          <w:sz w:val="20"/>
+        </w:rPr>
+        <w:t>Alinhar expectativa — este projeto é o agora, não o “crescimento mágico”.</w:t>
+      </w:r>
+    </w:p>
+    <w:p>
+      <w:pPr>
+        <w:spacing w:before="200" w:after="40"/>
+      </w:pPr>
+      <w:r>
+        <w:rPr>
+          <w:rFonts w:ascii="Calibri" w:hAnsi="Calibri" w:eastAsia="Calibri"/>
+          <w:b/>
+          <w:i w:val="0"/>
+          <w:color w:val="646464"/>
+          <w:sz w:val="18"/>
+        </w:rPr>
+        <w:t>FALA</w:t>
+      </w:r>
+    </w:p>
+    <w:p>
+      <w:pPr>
+        <w:spacing w:after="120" w:line="336" w:lineRule="auto"/>
+        <w:ind w:left="227"/>
+      </w:pPr>
+      <w:r>
+        <w:rPr>
+          <w:rFonts w:ascii="Calibri" w:hAnsi="Calibri" w:eastAsia="Calibri"/>
+          <w:b w:val="0"/>
+          <w:i/>
+          <w:color w:val="282828"/>
+          <w:sz w:val="22"/>
+        </w:rPr>
+        <w:t>“A ordem é simples, igual na loja: primeiro organizar o WhatsApp, depois atender com alguém responsável, depois anotar quem é o cliente, depois chamar de novo quem já compra. Sem isso, qualquer divulgação é dinheiro andando em círculo.”</w:t>
+      </w:r>
+    </w:p>
+    <w:p>
+      <w:pPr>
+        <w:spacing w:before="80" w:after="80"/>
+      </w:pPr>
+      <w:r>
+        <w:rPr>
+          <w:rFonts w:ascii="Calibri" w:hAnsi="Calibri" w:eastAsia="Calibri"/>
+          <w:b/>
+          <w:i w:val="0"/>
+          <w:color w:val="146E3C"/>
+          <w:sz w:val="20"/>
+        </w:rPr>
+        <w:t xml:space="preserve">Tradução: </w:t>
+      </w:r>
+      <w:r>
+        <w:rPr>
+          <w:rFonts w:ascii="Calibri" w:hAnsi="Calibri" w:eastAsia="Calibri"/>
+          <w:b w:val="0"/>
+          <w:i w:val="0"/>
+          <w:color w:val="3C3C3C"/>
+          <w:sz w:val="20"/>
+        </w:rPr>
+        <w:t>não fale “funil” nem “retenção”. Fale “atender bem” e “fazer o cliente voltar”.</w:t>
+      </w:r>
+    </w:p>
+    <w:p>
+      <w:pPr>
+        <w:spacing w:before="80" w:after="80"/>
+      </w:pPr>
+      <w:r>
+        <w:rPr>
+          <w:rFonts w:ascii="Calibri" w:hAnsi="Calibri" w:eastAsia="Calibri"/>
+          <w:b/>
+          <w:i w:val="0"/>
+          <w:color w:val="14508C"/>
+          <w:sz w:val="20"/>
+        </w:rPr>
+        <w:t xml:space="preserve">Pergunta / check: </w:t>
+      </w:r>
+      <w:r>
+        <w:rPr>
+          <w:rFonts w:ascii="Calibri" w:hAnsi="Calibri" w:eastAsia="Calibri"/>
+          <w:b w:val="0"/>
+          <w:i w:val="0"/>
+          <w:color w:val="3C3C3C"/>
+          <w:sz w:val="20"/>
+        </w:rPr>
+        <w:t>“Você topa a gente focar nisso agora — organizar — antes de pensar em anúncio novo?”</w:t>
+      </w:r>
+    </w:p>
+    <w:p>
+      <w:pPr>
+        <w:spacing w:before="160" w:after="160"/>
+        <w:pBdr>
+          <w:bottom w:val="single" w:sz="6" w:space="1" w:color="C9C9C9"/>
+        </w:pBdr>
+      </w:pPr>
+    </w:p>
+    <w:p>
+      <w:pPr>
+        <w:spacing w:before="200" w:after="40"/>
+      </w:pPr>
+      <w:r>
+        <w:rPr>
+          <w:rFonts w:ascii="Calibri" w:hAnsi="Calibri" w:eastAsia="Calibri"/>
+          <w:b/>
+          <w:i w:val="0"/>
+          <w:color w:val="B4141E"/>
+          <w:sz w:val="18"/>
+        </w:rPr>
+        <w:t>SLIDE 04 · PROMESSA (~30S)</w:t>
+      </w:r>
+    </w:p>
+    <w:p>
+      <w:pPr>
+        <w:spacing w:after="120"/>
+      </w:pPr>
+      <w:r>
+        <w:rPr>
+          <w:rFonts w:ascii="Calibri" w:hAnsi="Calibri" w:eastAsia="Calibri"/>
+          <w:b/>
+          <w:i w:val="0"/>
+          <w:color w:val="191919"/>
+          <w:sz w:val="28"/>
+        </w:rPr>
+        <w:t>Em 90 dias estrutura instalada na operação</w:t>
+      </w:r>
+    </w:p>
+    <w:p>
+      <w:pPr>
+        <w:spacing w:before="80" w:after="80"/>
+      </w:pPr>
+      <w:r>
+        <w:rPr>
+          <w:rFonts w:ascii="Calibri" w:hAnsi="Calibri" w:eastAsia="Calibri"/>
+          <w:b/>
+          <w:i w:val="0"/>
+          <w:color w:val="B4141E"/>
+          <w:sz w:val="20"/>
+        </w:rPr>
+        <w:t xml:space="preserve">Objetivo: </w:t>
+      </w:r>
+      <w:r>
+        <w:rPr>
+          <w:rFonts w:ascii="Calibri" w:hAnsi="Calibri" w:eastAsia="Calibri"/>
+          <w:b w:val="0"/>
+          <w:i w:val="0"/>
+          <w:color w:val="3C3C3C"/>
+          <w:sz w:val="20"/>
+        </w:rPr>
+        <w:t>Promessa curta e crível. Sem “consultoria de slides”.</w:t>
+      </w:r>
+    </w:p>
+    <w:p>
+      <w:pPr>
+        <w:spacing w:before="200" w:after="40"/>
+      </w:pPr>
+      <w:r>
+        <w:rPr>
+          <w:rFonts w:ascii="Calibri" w:hAnsi="Calibri" w:eastAsia="Calibri"/>
+          <w:b/>
+          <w:i w:val="0"/>
+          <w:color w:val="646464"/>
+          <w:sz w:val="18"/>
+        </w:rPr>
+        <w:t>FALA</w:t>
+      </w:r>
+    </w:p>
+    <w:p>
+      <w:pPr>
+        <w:spacing w:after="120" w:line="336" w:lineRule="auto"/>
+        <w:ind w:left="227"/>
+      </w:pPr>
+      <w:r>
+        <w:rPr>
+          <w:rFonts w:ascii="Calibri" w:hAnsi="Calibri" w:eastAsia="Calibri"/>
+          <w:b w:val="0"/>
+          <w:i/>
+          <w:color w:val="282828"/>
+          <w:sz w:val="22"/>
+        </w:rPr>
+        <w:t>“Em três meses a gente deixa isso funcionando na prática: WhatsApp organizado, pessoa treinada, resposta mesmo quando você estiver comprando, e um jeito de acompanhar quem chamou e quem comprou. Não é papel bonito. É rotina na loja.”</w:t>
+      </w:r>
+    </w:p>
+    <w:p>
+      <w:pPr>
+        <w:spacing w:before="80" w:after="80"/>
+      </w:pPr>
+      <w:r>
+        <w:rPr>
+          <w:rFonts w:ascii="Calibri" w:hAnsi="Calibri" w:eastAsia="Calibri"/>
+          <w:b/>
+          <w:i w:val="0"/>
+          <w:color w:val="14508C"/>
+          <w:sz w:val="20"/>
+        </w:rPr>
+        <w:t xml:space="preserve">Pergunta / check: </w:t>
+      </w:r>
+      <w:r>
+        <w:rPr>
+          <w:rFonts w:ascii="Calibri" w:hAnsi="Calibri" w:eastAsia="Calibri"/>
+          <w:b w:val="0"/>
+          <w:i w:val="0"/>
+          <w:color w:val="3C3C3C"/>
+          <w:sz w:val="20"/>
+        </w:rPr>
+        <w:t>Silêncio de 2 segundos. Deixa ela reagir.</w:t>
+      </w:r>
+    </w:p>
+    <w:p>
+      <w:pPr>
+        <w:spacing w:before="80" w:after="80"/>
+      </w:pPr>
+      <w:r>
+        <w:rPr>
+          <w:rFonts w:ascii="Calibri" w:hAnsi="Calibri" w:eastAsia="Calibri"/>
+          <w:b/>
+          <w:i w:val="0"/>
+          <w:color w:val="965A00"/>
+          <w:sz w:val="20"/>
+        </w:rPr>
+        <w:t xml:space="preserve">Evitar: </w:t>
+      </w:r>
+      <w:r>
+        <w:rPr>
+          <w:rFonts w:ascii="Calibri" w:hAnsi="Calibri" w:eastAsia="Calibri"/>
+          <w:b w:val="0"/>
+          <w:i w:val="0"/>
+          <w:color w:val="3C3C3C"/>
+          <w:sz w:val="20"/>
+        </w:rPr>
+        <w:t>“IA 24/7” · “máquina” · “ROI” · “escala”.</w:t>
+      </w:r>
+    </w:p>
+    <w:p>
+      <w:pPr>
+        <w:spacing w:before="160" w:after="160"/>
+        <w:pBdr>
+          <w:bottom w:val="single" w:sz="6" w:space="1" w:color="C9C9C9"/>
+        </w:pBdr>
+      </w:pPr>
+    </w:p>
+    <w:p>
+      <w:pPr>
+        <w:spacing w:before="200" w:after="40"/>
+      </w:pPr>
+      <w:r>
+        <w:rPr>
+          <w:rFonts w:ascii="Calibri" w:hAnsi="Calibri" w:eastAsia="Calibri"/>
+          <w:b/>
+          <w:i w:val="0"/>
+          <w:color w:val="B4141E"/>
+          <w:sz w:val="18"/>
+        </w:rPr>
+        <w:t>SLIDE 05 · CAPACIDADES (~1,5 MIN)</w:t>
+      </w:r>
+    </w:p>
+    <w:p>
+      <w:pPr>
+        <w:spacing w:after="120"/>
+      </w:pPr>
+      <w:r>
+        <w:rPr>
+          <w:rFonts w:ascii="Calibri" w:hAnsi="Calibri" w:eastAsia="Calibri"/>
+          <w:b/>
+          <w:i w:val="0"/>
+          <w:color w:val="191919"/>
+          <w:sz w:val="28"/>
+        </w:rPr>
+        <w:t>O que passa a existir na loja de vocês</w:t>
+      </w:r>
+    </w:p>
+    <w:p>
+      <w:pPr>
+        <w:spacing w:before="80" w:after="80"/>
+      </w:pPr>
+      <w:r>
+        <w:rPr>
+          <w:rFonts w:ascii="Calibri" w:hAnsi="Calibri" w:eastAsia="Calibri"/>
+          <w:b/>
+          <w:i w:val="0"/>
+          <w:color w:val="B4141E"/>
+          <w:sz w:val="20"/>
+        </w:rPr>
+        <w:t xml:space="preserve">Objetivo: </w:t>
+      </w:r>
+      <w:r>
+        <w:rPr>
+          <w:rFonts w:ascii="Calibri" w:hAnsi="Calibri" w:eastAsia="Calibri"/>
+          <w:b w:val="0"/>
+          <w:i w:val="0"/>
+          <w:color w:val="3C3C3C"/>
+          <w:sz w:val="20"/>
+        </w:rPr>
+        <w:t>Concretizar o que ela “leva” — em benefício, não em feature.</w:t>
+      </w:r>
+    </w:p>
+    <w:p>
+      <w:pPr>
+        <w:spacing w:before="200" w:after="40"/>
+      </w:pPr>
+      <w:r>
+        <w:rPr>
+          <w:rFonts w:ascii="Calibri" w:hAnsi="Calibri" w:eastAsia="Calibri"/>
+          <w:b/>
+          <w:i w:val="0"/>
+          <w:color w:val="646464"/>
+          <w:sz w:val="18"/>
+        </w:rPr>
+        <w:t>FALA</w:t>
+      </w:r>
+    </w:p>
+    <w:p>
+      <w:pPr>
+        <w:spacing w:after="120" w:line="336" w:lineRule="auto"/>
+        <w:ind w:left="227"/>
+      </w:pPr>
+      <w:r>
+        <w:rPr>
+          <w:rFonts w:ascii="Calibri" w:hAnsi="Calibri" w:eastAsia="Calibri"/>
+          <w:b w:val="0"/>
+          <w:i/>
+          <w:color w:val="282828"/>
+          <w:sz w:val="22"/>
+        </w:rPr>
+        <w:t>“Vou traduzir o que fica na Casa dos Pães, no dia a dia:”</w:t>
+      </w:r>
+    </w:p>
+    <w:p>
+      <w:pPr>
+        <w:spacing w:before="200" w:after="40"/>
+      </w:pPr>
+      <w:r>
+        <w:rPr>
+          <w:rFonts w:ascii="Calibri" w:hAnsi="Calibri" w:eastAsia="Calibri"/>
+          <w:b/>
+          <w:i w:val="0"/>
+          <w:color w:val="646464"/>
+          <w:sz w:val="18"/>
+        </w:rPr>
+        <w:t>APONTE / USE</w:t>
+      </w:r>
+    </w:p>
+    <w:p>
+      <w:pPr>
+        <w:pStyle w:val="ListBullet"/>
+        <w:spacing w:after="40"/>
+      </w:pPr>
+      <w:r>
+        <w:rPr>
+          <w:rFonts w:ascii="Calibri" w:hAnsi="Calibri" w:eastAsia="Calibri"/>
+          <w:b w:val="0"/>
+          <w:i w:val="0"/>
+          <w:color w:val="323232"/>
+          <w:sz w:val="21"/>
+        </w:rPr>
+        <w:t>Google e Instagram: “quem te achar, cai no WhatsApp certo — com botão claro.”</w:t>
+      </w:r>
+    </w:p>
+    <w:p>
+      <w:pPr>
+        <w:pStyle w:val="ListBullet"/>
+        <w:spacing w:after="40"/>
+      </w:pPr>
+      <w:r>
+        <w:rPr>
+          <w:rFonts w:ascii="Calibri" w:hAnsi="Calibri" w:eastAsia="Calibri"/>
+          <w:b w:val="0"/>
+          <w:i w:val="0"/>
+          <w:color w:val="323232"/>
+          <w:sz w:val="21"/>
+        </w:rPr>
+        <w:t>Catálogo + PIX: “o cliente vê produto e preço no zap e consegue pagar sem você inventar mensagem.”</w:t>
+      </w:r>
+    </w:p>
+    <w:p>
+      <w:pPr>
+        <w:pStyle w:val="ListBullet"/>
+        <w:spacing w:after="40"/>
+      </w:pPr>
+      <w:r>
+        <w:rPr>
+          <w:rFonts w:ascii="Calibri" w:hAnsi="Calibri" w:eastAsia="Calibri"/>
+          <w:b w:val="0"/>
+          <w:i w:val="0"/>
+          <w:color w:val="323232"/>
+          <w:sz w:val="21"/>
+        </w:rPr>
+        <w:t>Roteiro de atendimento: “a pessoa que atender sabe o que falar — promoção, pedido, dúvida de preço.”</w:t>
+      </w:r>
+    </w:p>
+    <w:p>
+      <w:pPr>
+        <w:pStyle w:val="ListBullet"/>
+        <w:spacing w:after="40"/>
+      </w:pPr>
+      <w:r>
+        <w:rPr>
+          <w:rFonts w:ascii="Calibri" w:hAnsi="Calibri" w:eastAsia="Calibri"/>
+          <w:b w:val="0"/>
+          <w:i w:val="0"/>
+          <w:color w:val="323232"/>
+          <w:sz w:val="21"/>
+        </w:rPr>
+        <w:t>Alguém no posto: “não é você no primeiro ‘oi’. Você entra só quando precisar.”</w:t>
+      </w:r>
+    </w:p>
+    <w:p>
+      <w:pPr>
+        <w:pStyle w:val="ListBullet"/>
+        <w:spacing w:after="40"/>
+      </w:pPr>
+      <w:r>
+        <w:rPr>
+          <w:rFonts w:ascii="Calibri" w:hAnsi="Calibri" w:eastAsia="Calibri"/>
+          <w:b w:val="0"/>
+          <w:i w:val="0"/>
+          <w:color w:val="323232"/>
+          <w:sz w:val="21"/>
+        </w:rPr>
+        <w:t>Cadastro de clientes: “nome e WhatsApp organizados — para chamar de novo quem já compra.”</w:t>
+      </w:r>
+    </w:p>
+    <w:p>
+      <w:pPr>
+        <w:pStyle w:val="ListBullet"/>
+        <w:spacing w:after="40"/>
+      </w:pPr>
+      <w:r>
+        <w:rPr>
+          <w:rFonts w:ascii="Calibri" w:hAnsi="Calibri" w:eastAsia="Calibri"/>
+          <w:b w:val="0"/>
+          <w:i w:val="0"/>
+          <w:color w:val="323232"/>
+          <w:sz w:val="21"/>
+        </w:rPr>
+        <w:t>Ajuda fora do horário: “uma resposta automática inteligente para não deixar a pessoa no vácuo — e passa pra gente humana quando for vender de verdade.”</w:t>
+      </w:r>
+    </w:p>
+    <w:p>
+      <w:pPr>
+        <w:spacing w:before="80" w:after="80"/>
+      </w:pPr>
+      <w:r>
+        <w:rPr>
+          <w:rFonts w:ascii="Calibri" w:hAnsi="Calibri" w:eastAsia="Calibri"/>
+          <w:b/>
+          <w:i w:val="0"/>
+          <w:color w:val="146E3C"/>
+          <w:sz w:val="20"/>
+        </w:rPr>
+        <w:t xml:space="preserve">Tradução: </w:t>
+      </w:r>
+      <w:r>
+        <w:rPr>
+          <w:rFonts w:ascii="Calibri" w:hAnsi="Calibri" w:eastAsia="Calibri"/>
+          <w:b w:val="0"/>
+          <w:i w:val="0"/>
+          <w:color w:val="3C3C3C"/>
+          <w:sz w:val="20"/>
+        </w:rPr>
+        <w:t>Nunca diga: GMB, LP, Kommo, SDR, handoff. Diga: Google da loja, página, cadastro, ajudante no zap, passar pra atendente.</w:t>
+      </w:r>
+    </w:p>
+    <w:p>
+      <w:pPr>
+        <w:spacing w:before="80" w:after="80"/>
+      </w:pPr>
+      <w:r>
+        <w:rPr>
+          <w:rFonts w:ascii="Calibri" w:hAnsi="Calibri" w:eastAsia="Calibri"/>
+          <w:b/>
+          <w:i w:val="0"/>
+          <w:color w:val="14508C"/>
+          <w:sz w:val="20"/>
+        </w:rPr>
+        <w:t xml:space="preserve">Pergunta / check: </w:t>
+      </w:r>
+      <w:r>
+        <w:rPr>
+          <w:rFonts w:ascii="Calibri" w:hAnsi="Calibri" w:eastAsia="Calibri"/>
+          <w:b w:val="0"/>
+          <w:i w:val="0"/>
+          <w:color w:val="3C3C3C"/>
+          <w:sz w:val="20"/>
+        </w:rPr>
+        <w:t>“Dessas coisas, qual aliviaria mais a sua semana?”</w:t>
+      </w:r>
+    </w:p>
+    <w:p>
+      <w:pPr>
+        <w:spacing w:before="160" w:after="160"/>
+        <w:pBdr>
+          <w:bottom w:val="single" w:sz="6" w:space="1" w:color="C9C9C9"/>
+        </w:pBdr>
+      </w:pPr>
+    </w:p>
+    <w:p>
+      <w:pPr>
+        <w:spacing w:before="200" w:after="40"/>
+      </w:pPr>
+      <w:r>
+        <w:rPr>
+          <w:rFonts w:ascii="Calibri" w:hAnsi="Calibri" w:eastAsia="Calibri"/>
+          <w:b/>
+          <w:i w:val="0"/>
+          <w:color w:val="B4141E"/>
+          <w:sz w:val="18"/>
+        </w:rPr>
+        <w:t>SLIDE 06 · MÉTODO (~45S)</w:t>
+      </w:r>
+    </w:p>
+    <w:p>
+      <w:pPr>
+        <w:spacing w:after="120"/>
+      </w:pPr>
+      <w:r>
+        <w:rPr>
+          <w:rFonts w:ascii="Calibri" w:hAnsi="Calibri" w:eastAsia="Calibri"/>
+          <w:b/>
+          <w:i w:val="0"/>
+          <w:color w:val="191919"/>
+          <w:sz w:val="28"/>
+        </w:rPr>
+        <w:t>Passo a passo — sem pular etapa</w:t>
+      </w:r>
+    </w:p>
+    <w:p>
+      <w:pPr>
+        <w:spacing w:before="80" w:after="80"/>
+      </w:pPr>
+      <w:r>
+        <w:rPr>
+          <w:rFonts w:ascii="Calibri" w:hAnsi="Calibri" w:eastAsia="Calibri"/>
+          <w:b/>
+          <w:i w:val="0"/>
+          <w:color w:val="B4141E"/>
+          <w:sz w:val="20"/>
+        </w:rPr>
+        <w:t xml:space="preserve">Objetivo: </w:t>
+      </w:r>
+      <w:r>
+        <w:rPr>
+          <w:rFonts w:ascii="Calibri" w:hAnsi="Calibri" w:eastAsia="Calibri"/>
+          <w:b w:val="0"/>
+          <w:i w:val="0"/>
+          <w:color w:val="3C3C3C"/>
+          <w:sz w:val="20"/>
+        </w:rPr>
+        <w:t>Explicar por que não começa com robô.</w:t>
+      </w:r>
+    </w:p>
+    <w:p>
+      <w:pPr>
+        <w:spacing w:before="200" w:after="40"/>
+      </w:pPr>
+      <w:r>
+        <w:rPr>
+          <w:rFonts w:ascii="Calibri" w:hAnsi="Calibri" w:eastAsia="Calibri"/>
+          <w:b/>
+          <w:i w:val="0"/>
+          <w:color w:val="646464"/>
+          <w:sz w:val="18"/>
+        </w:rPr>
+        <w:t>FALA</w:t>
+      </w:r>
+    </w:p>
+    <w:p>
+      <w:pPr>
+        <w:spacing w:after="120" w:line="336" w:lineRule="auto"/>
+        <w:ind w:left="227"/>
+      </w:pPr>
+      <w:r>
+        <w:rPr>
+          <w:rFonts w:ascii="Calibri" w:hAnsi="Calibri" w:eastAsia="Calibri"/>
+          <w:b w:val="0"/>
+          <w:i/>
+          <w:color w:val="282828"/>
+          <w:sz w:val="22"/>
+        </w:rPr>
+        <w:t>“A gente faz em ordem, igual receita de bolo: primeiro o produto e o preço no zap ficam claros, depois o jeito de atender, depois a pessoa treinada, e só no fim o ajudante automático. Se colocar robô em cima de bagunça, bagunça fica automática — e você se frustra de novo.”</w:t>
+      </w:r>
+    </w:p>
+    <w:p>
+      <w:pPr>
+        <w:spacing w:before="80" w:after="80"/>
+      </w:pPr>
+      <w:r>
+        <w:rPr>
+          <w:rFonts w:ascii="Calibri" w:hAnsi="Calibri" w:eastAsia="Calibri"/>
+          <w:b/>
+          <w:i w:val="0"/>
+          <w:color w:val="14508C"/>
+          <w:sz w:val="20"/>
+        </w:rPr>
+        <w:t xml:space="preserve">Pergunta / check: </w:t>
+      </w:r>
+      <w:r>
+        <w:rPr>
+          <w:rFonts w:ascii="Calibri" w:hAnsi="Calibri" w:eastAsia="Calibri"/>
+          <w:b w:val="0"/>
+          <w:i w:val="0"/>
+          <w:color w:val="3C3C3C"/>
+          <w:sz w:val="20"/>
+        </w:rPr>
+        <w:t>“Prefere a gente ir com calma nessa ordem, certo?”</w:t>
+      </w:r>
+    </w:p>
+    <w:p>
+      <w:pPr>
+        <w:spacing w:before="80" w:after="80"/>
+      </w:pPr>
+      <w:r>
+        <w:rPr>
+          <w:rFonts w:ascii="Calibri" w:hAnsi="Calibri" w:eastAsia="Calibri"/>
+          <w:b/>
+          <w:i w:val="0"/>
+          <w:color w:val="965A00"/>
+          <w:sz w:val="20"/>
+        </w:rPr>
+        <w:t xml:space="preserve">Evitar: </w:t>
+      </w:r>
+      <w:r>
+        <w:rPr>
+          <w:rFonts w:ascii="Calibri" w:hAnsi="Calibri" w:eastAsia="Calibri"/>
+          <w:b w:val="0"/>
+          <w:i w:val="0"/>
+          <w:color w:val="3C3C3C"/>
+          <w:sz w:val="20"/>
+        </w:rPr>
+        <w:t>falar “3P-IA” · “framework” · “metodologia proprietária”.</w:t>
+      </w:r>
+    </w:p>
+    <w:p>
+      <w:pPr>
+        <w:spacing w:before="160" w:after="160"/>
+        <w:pBdr>
+          <w:bottom w:val="single" w:sz="6" w:space="1" w:color="C9C9C9"/>
+        </w:pBdr>
+      </w:pPr>
+    </w:p>
+    <w:p>
+      <w:pPr>
+        <w:spacing w:before="200" w:after="40"/>
+      </w:pPr>
+      <w:r>
+        <w:rPr>
+          <w:rFonts w:ascii="Calibri" w:hAnsi="Calibri" w:eastAsia="Calibri"/>
+          <w:b/>
+          <w:i w:val="0"/>
+          <w:color w:val="B4141E"/>
+          <w:sz w:val="18"/>
+        </w:rPr>
+        <w:t>SLIDE 07 · 90 DIAS (~1 MIN)</w:t>
+      </w:r>
+    </w:p>
+    <w:p>
+      <w:pPr>
+        <w:spacing w:after="120"/>
+      </w:pPr>
+      <w:r>
+        <w:rPr>
+          <w:rFonts w:ascii="Calibri" w:hAnsi="Calibri" w:eastAsia="Calibri"/>
+          <w:b/>
+          <w:i w:val="0"/>
+          <w:color w:val="191919"/>
+          <w:sz w:val="28"/>
+        </w:rPr>
+        <w:t>Mês 1, 2 e 3 — o que acontece</w:t>
+      </w:r>
+    </w:p>
+    <w:p>
+      <w:pPr>
+        <w:spacing w:before="80" w:after="80"/>
+      </w:pPr>
+      <w:r>
+        <w:rPr>
+          <w:rFonts w:ascii="Calibri" w:hAnsi="Calibri" w:eastAsia="Calibri"/>
+          <w:b/>
+          <w:i w:val="0"/>
+          <w:color w:val="B4141E"/>
+          <w:sz w:val="20"/>
+        </w:rPr>
+        <w:t xml:space="preserve">Objetivo: </w:t>
+      </w:r>
+      <w:r>
+        <w:rPr>
+          <w:rFonts w:ascii="Calibri" w:hAnsi="Calibri" w:eastAsia="Calibri"/>
+          <w:b w:val="0"/>
+          <w:i w:val="0"/>
+          <w:color w:val="3C3C3C"/>
+          <w:sz w:val="20"/>
+        </w:rPr>
+        <w:t>Calendário mental simples.</w:t>
+      </w:r>
+    </w:p>
+    <w:p>
+      <w:pPr>
+        <w:spacing w:before="200" w:after="40"/>
+      </w:pPr>
+      <w:r>
+        <w:rPr>
+          <w:rFonts w:ascii="Calibri" w:hAnsi="Calibri" w:eastAsia="Calibri"/>
+          <w:b/>
+          <w:i w:val="0"/>
+          <w:color w:val="646464"/>
+          <w:sz w:val="18"/>
+        </w:rPr>
+        <w:t>FALA</w:t>
+      </w:r>
+    </w:p>
+    <w:p>
+      <w:pPr>
+        <w:spacing w:after="120" w:line="336" w:lineRule="auto"/>
+        <w:ind w:left="227"/>
+      </w:pPr>
+      <w:r>
+        <w:rPr>
+          <w:rFonts w:ascii="Calibri" w:hAnsi="Calibri" w:eastAsia="Calibri"/>
+          <w:b w:val="0"/>
+          <w:i/>
+          <w:color w:val="282828"/>
+          <w:sz w:val="22"/>
+        </w:rPr>
+        <w:t>“Mês 1: a gente arruma a porta de entrada — Google, Instagram, catálogo, PIX — e já começa a pegar nome e WhatsApp no caixa. Mês 2: treina quem vai atender, deixa o roteiro pronto, organiza o cadastro. Você sai da frente do primeiro atendimento. Mês 3: liga a ajuda automática fora do horário, as mensagens pra cliente voltar, e a gente te mostra o que melhorou.”</w:t>
+      </w:r>
+    </w:p>
+    <w:p>
+      <w:pPr>
+        <w:spacing w:after="120" w:line="336" w:lineRule="auto"/>
+        <w:ind w:left="227"/>
+      </w:pPr>
+      <w:r>
+        <w:rPr>
+          <w:rFonts w:ascii="Calibri" w:hAnsi="Calibri" w:eastAsia="Calibri"/>
+          <w:b w:val="0"/>
+          <w:i/>
+          <w:color w:val="282828"/>
+          <w:sz w:val="22"/>
+        </w:rPr>
+        <w:t>“Os R$ 500 mil continuam sendo a meta grande da Casa dos Pães. Estes 90 dias são o alicerce — pra operação aguentar o caminho sem você carregar tudo nas costas.”</w:t>
+      </w:r>
+    </w:p>
+    <w:p>
+      <w:pPr>
+        <w:spacing w:before="80" w:after="80"/>
+      </w:pPr>
+      <w:r>
+        <w:rPr>
+          <w:rFonts w:ascii="Calibri" w:hAnsi="Calibri" w:eastAsia="Calibri"/>
+          <w:b/>
+          <w:i w:val="0"/>
+          <w:color w:val="14508C"/>
+          <w:sz w:val="20"/>
+        </w:rPr>
+        <w:t xml:space="preserve">Pergunta / check: </w:t>
+      </w:r>
+      <w:r>
+        <w:rPr>
+          <w:rFonts w:ascii="Calibri" w:hAnsi="Calibri" w:eastAsia="Calibri"/>
+          <w:b w:val="0"/>
+          <w:i w:val="0"/>
+          <w:color w:val="3C3C3C"/>
+          <w:sz w:val="20"/>
+        </w:rPr>
+        <w:t>“Tem alguém aí que poderia ser essa pessoa do WhatsApp — mesmo que seja meio período?”</w:t>
+      </w:r>
+    </w:p>
+    <w:p>
+      <w:pPr>
+        <w:spacing w:before="160" w:after="160"/>
+        <w:pBdr>
+          <w:bottom w:val="single" w:sz="6" w:space="1" w:color="C9C9C9"/>
+        </w:pBdr>
+      </w:pPr>
+    </w:p>
+    <w:p>
+      <w:pPr>
+        <w:spacing w:before="200" w:after="40"/>
+      </w:pPr>
+      <w:r>
+        <w:rPr>
+          <w:rFonts w:ascii="Calibri" w:hAnsi="Calibri" w:eastAsia="Calibri"/>
+          <w:b/>
+          <w:i w:val="0"/>
+          <w:color w:val="B4141E"/>
+          <w:sz w:val="18"/>
+        </w:rPr>
+        <w:t>SLIDE 08 · SUCESSO (~45S)</w:t>
+      </w:r>
+    </w:p>
+    <w:p>
+      <w:pPr>
+        <w:spacing w:after="120"/>
+      </w:pPr>
+      <w:r>
+        <w:rPr>
+          <w:rFonts w:ascii="Calibri" w:hAnsi="Calibri" w:eastAsia="Calibri"/>
+          <w:b/>
+          <w:i w:val="0"/>
+          <w:color w:val="191919"/>
+          <w:sz w:val="28"/>
+        </w:rPr>
+        <w:t>O que vamos olhar juntos</w:t>
+      </w:r>
+    </w:p>
+    <w:p>
+      <w:pPr>
+        <w:spacing w:before="80" w:after="80"/>
+      </w:pPr>
+      <w:r>
+        <w:rPr>
+          <w:rFonts w:ascii="Calibri" w:hAnsi="Calibri" w:eastAsia="Calibri"/>
+          <w:b/>
+          <w:i w:val="0"/>
+          <w:color w:val="B4141E"/>
+          <w:sz w:val="20"/>
+        </w:rPr>
+        <w:t xml:space="preserve">Objetivo: </w:t>
+      </w:r>
+      <w:r>
+        <w:rPr>
+          <w:rFonts w:ascii="Calibri" w:hAnsi="Calibri" w:eastAsia="Calibri"/>
+          <w:b w:val="0"/>
+          <w:i w:val="0"/>
+          <w:color w:val="3C3C3C"/>
+          <w:sz w:val="20"/>
+        </w:rPr>
+        <w:t>Critérios honestos — ela entende “como saber se está funcionando”.</w:t>
+      </w:r>
+    </w:p>
+    <w:p>
+      <w:pPr>
+        <w:spacing w:before="200" w:after="40"/>
+      </w:pPr>
+      <w:r>
+        <w:rPr>
+          <w:rFonts w:ascii="Calibri" w:hAnsi="Calibri" w:eastAsia="Calibri"/>
+          <w:b/>
+          <w:i w:val="0"/>
+          <w:color w:val="646464"/>
+          <w:sz w:val="18"/>
+        </w:rPr>
+        <w:t>FALA</w:t>
+      </w:r>
+    </w:p>
+    <w:p>
+      <w:pPr>
+        <w:spacing w:after="120" w:line="336" w:lineRule="auto"/>
+        <w:ind w:left="227"/>
+      </w:pPr>
+      <w:r>
+        <w:rPr>
+          <w:rFonts w:ascii="Calibri" w:hAnsi="Calibri" w:eastAsia="Calibri"/>
+          <w:b w:val="0"/>
+          <w:i/>
+          <w:color w:val="282828"/>
+          <w:sz w:val="22"/>
+        </w:rPr>
+        <w:t>“A gente não vai te encher de gráfico. Vamos olhar coisa de loja: se a mensagem é respondida rápido, se menos gente fica no vácuo, se o cadastro de cliente está crescendo, se dá pra chamar quem já comprou, e se suas horas no WhatsApp caem. Isso é sucesso deste projeto.”</w:t>
+      </w:r>
+    </w:p>
+    <w:p>
+      <w:pPr>
+        <w:spacing w:before="80" w:after="80"/>
+      </w:pPr>
+      <w:r>
+        <w:rPr>
+          <w:rFonts w:ascii="Calibri" w:hAnsi="Calibri" w:eastAsia="Calibri"/>
+          <w:b/>
+          <w:i w:val="0"/>
+          <w:color w:val="14508C"/>
+          <w:sz w:val="20"/>
+        </w:rPr>
+        <w:t xml:space="preserve">Pergunta / check: </w:t>
+      </w:r>
+      <w:r>
+        <w:rPr>
+          <w:rFonts w:ascii="Calibri" w:hAnsi="Calibri" w:eastAsia="Calibri"/>
+          <w:b w:val="0"/>
+          <w:i w:val="0"/>
+          <w:color w:val="3C3C3C"/>
+          <w:sz w:val="20"/>
+        </w:rPr>
+        <w:t>“Se em 90 dias você estiver menos presa no zap e o cliente for melhor atendido — isso já valeria o esforço?”</w:t>
+      </w:r>
+    </w:p>
+    <w:p>
+      <w:pPr>
+        <w:spacing w:before="80" w:after="80"/>
+      </w:pPr>
+      <w:r>
+        <w:rPr>
+          <w:rFonts w:ascii="Calibri" w:hAnsi="Calibri" w:eastAsia="Calibri"/>
+          <w:b/>
+          <w:i w:val="0"/>
+          <w:color w:val="965A00"/>
+          <w:sz w:val="20"/>
+        </w:rPr>
+        <w:t xml:space="preserve">Evitar: </w:t>
+      </w:r>
+      <w:r>
+        <w:rPr>
+          <w:rFonts w:ascii="Calibri" w:hAnsi="Calibri" w:eastAsia="Calibri"/>
+          <w:b w:val="0"/>
+          <w:i w:val="0"/>
+          <w:color w:val="3C3C3C"/>
+          <w:sz w:val="20"/>
+        </w:rPr>
+        <w:t>CAC, LTV, taxa de conversão, KPI, “vaidade”.</w:t>
+      </w:r>
+    </w:p>
+    <w:p>
+      <w:pPr>
+        <w:spacing w:before="160" w:after="160"/>
+        <w:pBdr>
+          <w:bottom w:val="single" w:sz="6" w:space="1" w:color="C9C9C9"/>
+        </w:pBdr>
+      </w:pPr>
+    </w:p>
+    <w:p>
+      <w:pPr>
+        <w:spacing w:before="200" w:after="40"/>
+      </w:pPr>
+      <w:r>
+        <w:rPr>
+          <w:rFonts w:ascii="Calibri" w:hAnsi="Calibri" w:eastAsia="Calibri"/>
+          <w:b/>
+          <w:i w:val="0"/>
+          <w:color w:val="B4141E"/>
+          <w:sz w:val="18"/>
+        </w:rPr>
+        <w:t>SLIDE 09 · ENCAIXE (~45S)</w:t>
+      </w:r>
+    </w:p>
+    <w:p>
+      <w:pPr>
+        <w:spacing w:after="120"/>
+      </w:pPr>
+      <w:r>
+        <w:rPr>
+          <w:rFonts w:ascii="Calibri" w:hAnsi="Calibri" w:eastAsia="Calibri"/>
+          <w:b/>
+          <w:i w:val="0"/>
+          <w:color w:val="191919"/>
+          <w:sz w:val="28"/>
+        </w:rPr>
+        <w:t>Do jeito da Casa dos Pães</w:t>
+      </w:r>
+    </w:p>
+    <w:p>
+      <w:pPr>
+        <w:spacing w:before="80" w:after="80"/>
+      </w:pPr>
+      <w:r>
+        <w:rPr>
+          <w:rFonts w:ascii="Calibri" w:hAnsi="Calibri" w:eastAsia="Calibri"/>
+          <w:b/>
+          <w:i w:val="0"/>
+          <w:color w:val="B4141E"/>
+          <w:sz w:val="20"/>
+        </w:rPr>
+        <w:t xml:space="preserve">Objetivo: </w:t>
+      </w:r>
+      <w:r>
+        <w:rPr>
+          <w:rFonts w:ascii="Calibri" w:hAnsi="Calibri" w:eastAsia="Calibri"/>
+          <w:b w:val="0"/>
+          <w:i w:val="0"/>
+          <w:color w:val="3C3C3C"/>
+          <w:sz w:val="20"/>
+        </w:rPr>
+        <w:t>Personalizar + gate do atendente sem soar como ameaça.</w:t>
+      </w:r>
+    </w:p>
+    <w:p>
+      <w:pPr>
+        <w:spacing w:before="200" w:after="40"/>
+      </w:pPr>
+      <w:r>
+        <w:rPr>
+          <w:rFonts w:ascii="Calibri" w:hAnsi="Calibri" w:eastAsia="Calibri"/>
+          <w:b/>
+          <w:i w:val="0"/>
+          <w:color w:val="646464"/>
+          <w:sz w:val="18"/>
+        </w:rPr>
+        <w:t>FALA</w:t>
+      </w:r>
+    </w:p>
+    <w:p>
+      <w:pPr>
+        <w:spacing w:after="120" w:line="336" w:lineRule="auto"/>
+        <w:ind w:left="227"/>
+      </w:pPr>
+      <w:r>
+        <w:rPr>
+          <w:rFonts w:ascii="Calibri" w:hAnsi="Calibri" w:eastAsia="Calibri"/>
+          <w:b w:val="0"/>
+          <w:i/>
+          <w:color w:val="282828"/>
+          <w:sz w:val="22"/>
+        </w:rPr>
+        <w:t>“Isso não é pacote genérico de internet. No zap de vocês: um jeito pra promoção e outro pra pedido — pra não misturar. No caixa: pedir nome e WhatsApp com naturalidade — ‘pra te avisar das ofertas’. E tem um combinado importante: precisa ter alguém pra atender, mesmo que meio período. Sem isso, qualquer solução — a nossa inclusive — trava. Porque alguém tem que fechar a venda com o cliente.”</w:t>
+      </w:r>
+    </w:p>
+    <w:p>
+      <w:pPr>
+        <w:spacing w:before="80" w:after="80"/>
+      </w:pPr>
+      <w:r>
+        <w:rPr>
+          <w:rFonts w:ascii="Calibri" w:hAnsi="Calibri" w:eastAsia="Calibri"/>
+          <w:b/>
+          <w:i w:val="0"/>
+          <w:color w:val="14508C"/>
+          <w:sz w:val="20"/>
+        </w:rPr>
+        <w:t xml:space="preserve">Pergunta / check: </w:t>
+      </w:r>
+      <w:r>
+        <w:rPr>
+          <w:rFonts w:ascii="Calibri" w:hAnsi="Calibri" w:eastAsia="Calibri"/>
+          <w:b w:val="0"/>
+          <w:i w:val="0"/>
+          <w:color w:val="3C3C3C"/>
+          <w:sz w:val="20"/>
+        </w:rPr>
+        <w:t>“Quem você vê nessa função nas próximas semanas?”</w:t>
+      </w:r>
+    </w:p>
+    <w:p>
+      <w:pPr>
+        <w:spacing w:before="80" w:after="80"/>
+      </w:pPr>
+      <w:r>
+        <w:rPr>
+          <w:rFonts w:ascii="Calibri" w:hAnsi="Calibri" w:eastAsia="Calibri"/>
+          <w:b/>
+          <w:i w:val="0"/>
+          <w:color w:val="965A00"/>
+          <w:sz w:val="20"/>
+        </w:rPr>
+        <w:t xml:space="preserve">Evitar: </w:t>
+      </w:r>
+      <w:r>
+        <w:rPr>
+          <w:rFonts w:ascii="Calibri" w:hAnsi="Calibri" w:eastAsia="Calibri"/>
+          <w:b w:val="0"/>
+          <w:i w:val="0"/>
+          <w:color w:val="3C3C3C"/>
+          <w:sz w:val="20"/>
+        </w:rPr>
+        <w:t>“gate inegociável” · “sem isso não fechamos” em tom duro. Seja firme e cuidadoso.</w:t>
+      </w:r>
+    </w:p>
+    <w:p>
+      <w:pPr>
+        <w:spacing w:before="160" w:after="160"/>
+        <w:pBdr>
+          <w:bottom w:val="single" w:sz="6" w:space="1" w:color="C9C9C9"/>
+        </w:pBdr>
+      </w:pPr>
+    </w:p>
+    <w:p>
+      <w:pPr>
+        <w:spacing w:before="200" w:after="40"/>
+      </w:pPr>
+      <w:r>
+        <w:rPr>
+          <w:rFonts w:ascii="Calibri" w:hAnsi="Calibri" w:eastAsia="Calibri"/>
+          <w:b/>
+          <w:i w:val="0"/>
+          <w:color w:val="B4141E"/>
+          <w:sz w:val="18"/>
+        </w:rPr>
+        <w:t>SLIDE 10 · INVESTIMENTO (~1 MIN)</w:t>
+      </w:r>
+    </w:p>
+    <w:p>
+      <w:pPr>
+        <w:spacing w:after="120"/>
+      </w:pPr>
+      <w:r>
+        <w:rPr>
+          <w:rFonts w:ascii="Calibri" w:hAnsi="Calibri" w:eastAsia="Calibri"/>
+          <w:b/>
+          <w:i w:val="0"/>
+          <w:color w:val="191919"/>
+          <w:sz w:val="28"/>
+        </w:rPr>
+        <w:t>Valor · só depois do desenho quieto</w:t>
+      </w:r>
+    </w:p>
+    <w:p>
+      <w:pPr>
+        <w:spacing w:before="80" w:after="80"/>
+      </w:pPr>
+      <w:r>
+        <w:rPr>
+          <w:rFonts w:ascii="Calibri" w:hAnsi="Calibri" w:eastAsia="Calibri"/>
+          <w:b/>
+          <w:i w:val="0"/>
+          <w:color w:val="B4141E"/>
+          <w:sz w:val="20"/>
+        </w:rPr>
+        <w:t xml:space="preserve">Objetivo: </w:t>
+      </w:r>
+      <w:r>
+        <w:rPr>
+          <w:rFonts w:ascii="Calibri" w:hAnsi="Calibri" w:eastAsia="Calibri"/>
+          <w:b w:val="0"/>
+          <w:i w:val="0"/>
+          <w:color w:val="3C3C3C"/>
+          <w:sz w:val="20"/>
+        </w:rPr>
+        <w:t>Preço com calma. Pedir o sim. Sem âncora de carro de som.</w:t>
+      </w:r>
+    </w:p>
+    <w:p>
+      <w:pPr>
+        <w:spacing w:before="200" w:after="40"/>
+      </w:pPr>
+      <w:r>
+        <w:rPr>
+          <w:rFonts w:ascii="Calibri" w:hAnsi="Calibri" w:eastAsia="Calibri"/>
+          <w:b/>
+          <w:i w:val="0"/>
+          <w:color w:val="646464"/>
+          <w:sz w:val="18"/>
+        </w:rPr>
+        <w:t>FALA</w:t>
+      </w:r>
+    </w:p>
+    <w:p>
+      <w:pPr>
+        <w:spacing w:after="120" w:line="336" w:lineRule="auto"/>
+        <w:ind w:left="227"/>
+      </w:pPr>
+      <w:r>
+        <w:rPr>
+          <w:rFonts w:ascii="Calibri" w:hAnsi="Calibri" w:eastAsia="Calibri"/>
+          <w:b w:val="0"/>
+          <w:i/>
+          <w:color w:val="282828"/>
+          <w:sz w:val="22"/>
+        </w:rPr>
+        <w:t>“Investimento do projeto de três meses: R$ 18 mil à vista, ou em até 12 vezes de R$ 1.666,67 no cartão. Entra a organização completa do WhatsApp, treino, cadastro de clientes, resposta fora do horário e o relatório do que melhorou. Não entra gestão de anúncio pago neste momento — de propósito. Primeiro a casa atender.”</w:t>
+      </w:r>
+    </w:p>
+    <w:p>
+      <w:pPr>
+        <w:spacing w:after="120" w:line="336" w:lineRule="auto"/>
+        <w:ind w:left="227"/>
+      </w:pPr>
+      <w:r>
+        <w:rPr>
+          <w:rFonts w:ascii="Calibri" w:hAnsi="Calibri" w:eastAsia="Calibri"/>
+          <w:b w:val="0"/>
+          <w:i/>
+          <w:color w:val="282828"/>
+          <w:sz w:val="22"/>
+        </w:rPr>
+        <w:t>“Nilda, o próximo passo é simples: a gente formaliza, marca o início, e você indica quem vai ficar no atendimento com a gente.”</w:t>
+      </w:r>
+    </w:p>
+    <w:p>
+      <w:pPr>
+        <w:spacing w:before="200" w:after="40"/>
+      </w:pPr>
+      <w:r>
+        <w:rPr>
+          <w:rFonts w:ascii="Calibri" w:hAnsi="Calibri" w:eastAsia="Calibri"/>
+          <w:b/>
+          <w:i w:val="0"/>
+          <w:color w:val="646464"/>
+          <w:sz w:val="18"/>
+        </w:rPr>
+        <w:t>APONTE / USE</w:t>
+      </w:r>
+    </w:p>
+    <w:p>
+      <w:pPr>
+        <w:pStyle w:val="ListBullet"/>
+        <w:spacing w:after="40"/>
+      </w:pPr>
+      <w:r>
+        <w:rPr>
+          <w:rFonts w:ascii="Calibri" w:hAnsi="Calibri" w:eastAsia="Calibri"/>
+          <w:b w:val="0"/>
+          <w:i w:val="0"/>
+          <w:color w:val="323232"/>
+          <w:sz w:val="21"/>
+        </w:rPr>
+        <w:t>Se travar no valor: “Entendo. O que mais pesa: o valor total ou a organização do pagamento?”</w:t>
+      </w:r>
+    </w:p>
+    <w:p>
+      <w:pPr>
+        <w:pStyle w:val="ListBullet"/>
+        <w:spacing w:after="40"/>
+      </w:pPr>
+      <w:r>
+        <w:rPr>
+          <w:rFonts w:ascii="Calibri" w:hAnsi="Calibri" w:eastAsia="Calibri"/>
+          <w:b w:val="0"/>
+          <w:i w:val="0"/>
+          <w:color w:val="323232"/>
+          <w:sz w:val="21"/>
+        </w:rPr>
+        <w:t>“Quer que a gente olhe o parcelado pra caber no mês?”</w:t>
+      </w:r>
+    </w:p>
+    <w:p>
+      <w:pPr>
+        <w:pStyle w:val="ListBullet"/>
+        <w:spacing w:after="40"/>
+      </w:pPr>
+      <w:r>
+        <w:rPr>
+          <w:rFonts w:ascii="Calibri" w:hAnsi="Calibri" w:eastAsia="Calibri"/>
+          <w:b w:val="0"/>
+          <w:i w:val="0"/>
+          <w:color w:val="323232"/>
+          <w:sz w:val="21"/>
+        </w:rPr>
+        <w:t>Não invente desconto. Não compare com carro de som nesta sala.</w:t>
+      </w:r>
+    </w:p>
+    <w:p>
+      <w:pPr>
+        <w:spacing w:before="80" w:after="80"/>
+      </w:pPr>
+      <w:r>
+        <w:rPr>
+          <w:rFonts w:ascii="Calibri" w:hAnsi="Calibri" w:eastAsia="Calibri"/>
+          <w:b/>
+          <w:i w:val="0"/>
+          <w:color w:val="14508C"/>
+          <w:sz w:val="20"/>
+        </w:rPr>
+        <w:t xml:space="preserve">Pergunta / check: </w:t>
+      </w:r>
+      <w:r>
+        <w:rPr>
+          <w:rFonts w:ascii="Calibri" w:hAnsi="Calibri" w:eastAsia="Calibri"/>
+          <w:b w:val="0"/>
+          <w:i w:val="0"/>
+          <w:color w:val="3C3C3C"/>
+          <w:sz w:val="20"/>
+        </w:rPr>
+        <w:t>CTA: “Podemos avançar com esse projeto e já marcar a data de começo?”</w:t>
+      </w:r>
+    </w:p>
+    <w:p>
+      <w:pPr>
+        <w:spacing w:before="80" w:after="80"/>
+      </w:pPr>
+      <w:r>
+        <w:rPr>
+          <w:rFonts w:ascii="Calibri" w:hAnsi="Calibri" w:eastAsia="Calibri"/>
+          <w:b/>
+          <w:i w:val="0"/>
+          <w:color w:val="965A00"/>
+          <w:sz w:val="20"/>
+        </w:rPr>
+        <w:t xml:space="preserve">Evitar: </w:t>
+      </w:r>
+      <w:r>
+        <w:rPr>
+          <w:rFonts w:ascii="Calibri" w:hAnsi="Calibri" w:eastAsia="Calibri"/>
+          <w:b w:val="0"/>
+          <w:i w:val="0"/>
+          <w:color w:val="3C3C3C"/>
+          <w:sz w:val="20"/>
+        </w:rPr>
+        <w:t>“de R$ 30 mil” com tom de pechincha · pressão · prometer R$ 500 mil.</w:t>
+      </w:r>
+    </w:p>
+    <w:p>
+      <w:pPr>
+        <w:spacing w:before="160" w:after="160"/>
+        <w:pBdr>
+          <w:bottom w:val="single" w:sz="6" w:space="1" w:color="C9C9C9"/>
+        </w:pBdr>
+      </w:pPr>
+    </w:p>
+    <w:p>
+      <w:pPr>
+        <w:spacing w:after="120"/>
+      </w:pPr>
+      <w:r>
+        <w:rPr>
+          <w:rFonts w:ascii="Calibri" w:hAnsi="Calibri" w:eastAsia="Calibri"/>
+          <w:b/>
+          <w:i w:val="0"/>
+          <w:color w:val="B4141E"/>
+          <w:sz w:val="32"/>
+        </w:rPr>
+        <w:t>Se perder o fio</w:t>
+      </w:r>
+    </w:p>
+    <w:p>
+      <w:pPr>
+        <w:spacing w:after="80" w:line="324" w:lineRule="auto"/>
+      </w:pPr>
+      <w:r>
+        <w:rPr>
+          <w:rFonts w:ascii="Calibri" w:hAnsi="Calibri" w:eastAsia="Calibri"/>
+          <w:b/>
+          <w:i w:val="0"/>
+          <w:color w:val="1E1E1E"/>
+          <w:sz w:val="22"/>
+        </w:rPr>
+        <w:t>Volta no slide 02.</w:t>
+      </w:r>
+    </w:p>
+    <w:p>
+      <w:pPr>
+        <w:spacing w:after="120" w:line="336" w:lineRule="auto"/>
+        <w:ind w:left="227"/>
+      </w:pPr>
+      <w:r>
+        <w:rPr>
+          <w:rFonts w:ascii="Calibri" w:hAnsi="Calibri" w:eastAsia="Calibri"/>
+          <w:b w:val="0"/>
+          <w:i/>
+          <w:color w:val="282828"/>
+          <w:sz w:val="22"/>
+        </w:rPr>
+        <w:t>“Cliente já chama. Você está na rua. A venda esfria. A gente organiza o WhatsApp pra isso parar.”</w:t>
+      </w:r>
+    </w:p>
+    <w:p>
+      <w:pPr>
+        <w:spacing w:after="80" w:line="324" w:lineRule="auto"/>
+      </w:pPr>
+      <w:r>
+        <w:rPr>
+          <w:rFonts w:ascii="Calibri" w:hAnsi="Calibri" w:eastAsia="Calibri"/>
+          <w:b w:val="0"/>
+          <w:i w:val="0"/>
+          <w:color w:val="1E1E1E"/>
+          <w:sz w:val="22"/>
+        </w:rPr>
+        <w:t>Método e preço só existem porque essa frase é verdade.</w:t>
+      </w:r>
+    </w:p>
+    <w:p>
+      <w:pPr>
+        <w:spacing w:before="160" w:after="160"/>
+        <w:pBdr>
+          <w:bottom w:val="single" w:sz="6" w:space="1" w:color="C9C9C9"/>
+        </w:pBdr>
+      </w:pPr>
+    </w:p>
+    <w:p>
+      <w:pPr>
+        <w:spacing w:after="120"/>
+      </w:pPr>
+      <w:r>
+        <w:rPr>
+          <w:rFonts w:ascii="Calibri" w:hAnsi="Calibri" w:eastAsia="Calibri"/>
+          <w:b/>
+          <w:i w:val="0"/>
+          <w:color w:val="B4141E"/>
+          <w:sz w:val="32"/>
+        </w:rPr>
+        <w:t>Objeções · respostas curtas</w:t>
+      </w:r>
+    </w:p>
+    <w:p>
+      <w:pPr>
+        <w:spacing w:after="80" w:line="324" w:lineRule="auto"/>
+      </w:pPr>
+      <w:r>
+        <w:rPr>
+          <w:rFonts w:ascii="Calibri" w:hAnsi="Calibri" w:eastAsia="Calibri"/>
+          <w:b/>
+          <w:i w:val="0"/>
+          <w:color w:val="1E1E1E"/>
+          <w:sz w:val="22"/>
+        </w:rPr>
+        <w:t>“Quero anúncio / filmagem agora”</w:t>
+      </w:r>
+    </w:p>
+    <w:p>
+      <w:pPr>
+        <w:spacing w:after="120" w:line="336" w:lineRule="auto"/>
+        <w:ind w:left="227"/>
+      </w:pPr>
+      <w:r>
+        <w:rPr>
+          <w:rFonts w:ascii="Calibri" w:hAnsi="Calibri" w:eastAsia="Calibri"/>
+          <w:b w:val="0"/>
+          <w:i/>
+          <w:color w:val="282828"/>
+          <w:sz w:val="22"/>
+        </w:rPr>
+        <w:t>“Podemos. Mas se o zap não responde, você paga pra cliente ficar bravo. Primeiro a gente segura o atendimento.”</w:t>
+      </w:r>
+    </w:p>
+    <w:p>
+      <w:pPr>
+        <w:spacing w:after="80" w:line="324" w:lineRule="auto"/>
+      </w:pPr>
+      <w:r>
+        <w:rPr>
+          <w:rFonts w:ascii="Calibri" w:hAnsi="Calibri" w:eastAsia="Calibri"/>
+          <w:b/>
+          <w:i w:val="0"/>
+          <w:color w:val="1E1E1E"/>
+          <w:sz w:val="22"/>
+        </w:rPr>
+        <w:t>“Já gastei e não deu certo”</w:t>
+      </w:r>
+    </w:p>
+    <w:p>
+      <w:pPr>
+        <w:spacing w:after="120" w:line="336" w:lineRule="auto"/>
+        <w:ind w:left="227"/>
+      </w:pPr>
+      <w:r>
+        <w:rPr>
+          <w:rFonts w:ascii="Calibri" w:hAnsi="Calibri" w:eastAsia="Calibri"/>
+          <w:b w:val="0"/>
+          <w:i/>
+          <w:color w:val="282828"/>
+          <w:sz w:val="22"/>
+        </w:rPr>
+        <w:t>“Antes faltou constância e organização. Aqui a entrega é rotina funcionando — não campanha solta.”</w:t>
+      </w:r>
+    </w:p>
+    <w:p>
+      <w:pPr>
+        <w:spacing w:after="80" w:line="324" w:lineRule="auto"/>
+      </w:pPr>
+      <w:r>
+        <w:rPr>
+          <w:rFonts w:ascii="Calibri" w:hAnsi="Calibri" w:eastAsia="Calibri"/>
+          <w:b/>
+          <w:i w:val="0"/>
+          <w:color w:val="1E1E1E"/>
+          <w:sz w:val="22"/>
+        </w:rPr>
+        <w:t>“Não tenho gente”</w:t>
+      </w:r>
+    </w:p>
+    <w:p>
+      <w:pPr>
+        <w:spacing w:after="120" w:line="336" w:lineRule="auto"/>
+        <w:ind w:left="227"/>
+      </w:pPr>
+      <w:r>
+        <w:rPr>
+          <w:rFonts w:ascii="Calibri" w:hAnsi="Calibri" w:eastAsia="Calibri"/>
+          <w:b w:val="0"/>
+          <w:i/>
+          <w:color w:val="282828"/>
+          <w:sz w:val="22"/>
+        </w:rPr>
+        <w:t>“Precisa de pelo menos uma pessoa, mesmo meio período. O automático ajuda na porta; gente fecha a venda. Sem isso qualquer caminho falha.”</w:t>
+      </w:r>
+    </w:p>
+    <w:p>
+      <w:pPr>
+        <w:spacing w:after="80" w:line="324" w:lineRule="auto"/>
+      </w:pPr>
+      <w:r>
+        <w:rPr>
+          <w:rFonts w:ascii="Calibri" w:hAnsi="Calibri" w:eastAsia="Calibri"/>
+          <w:b/>
+          <w:i w:val="0"/>
+          <w:color w:val="1E1E1E"/>
+          <w:sz w:val="22"/>
+        </w:rPr>
+        <w:t>“Está caro”</w:t>
+      </w:r>
+    </w:p>
+    <w:p>
+      <w:pPr>
+        <w:spacing w:after="120" w:line="336" w:lineRule="auto"/>
+        <w:ind w:left="227"/>
+      </w:pPr>
+      <w:r>
+        <w:rPr>
+          <w:rFonts w:ascii="Calibri" w:hAnsi="Calibri" w:eastAsia="Calibri"/>
+          <w:b w:val="0"/>
+          <w:i/>
+          <w:color w:val="282828"/>
+          <w:sz w:val="22"/>
+        </w:rPr>
+        <w:t>“É um projeto de três meses pra tirar o aperto do seu colo. Quer que a gente olhe o parcelado?”</w:t>
+      </w:r>
+    </w:p>
+    <w:p>
+      <w:pPr>
+        <w:spacing w:before="160" w:after="160"/>
+        <w:pBdr>
+          <w:bottom w:val="single" w:sz="6" w:space="1" w:color="C9C9C9"/>
+        </w:pBdr>
+      </w:pPr>
+    </w:p>
+    <w:p>
+      <w:pPr>
+        <w:spacing w:after="160"/>
+      </w:pPr>
+      <w:r>
+        <w:rPr>
+          <w:rFonts w:ascii="Calibri" w:hAnsi="Calibri" w:eastAsia="Calibri"/>
+          <w:b w:val="0"/>
+          <w:i w:val="0"/>
+          <w:color w:val="646464"/>
+          <w:sz w:val="18"/>
+        </w:rPr>
+        <w:t>Uso interno V4 · Casa dos Pães × ZapFirst Plano Base · Script alinhado ao deck EQV de 10 slides</w:t>
       </w:r>
     </w:p>
     <w:sectPr>
       <w:pgSz w:w="12240" w:h="15840"/>
-      <w:pgMar w:top="1134" w:right="1247" w:bottom="1134" w:left="1247" w:header="720" w:footer="720" w:gutter="0"/>
+      <w:pgMar w:top="1020" w:right="1134" w:bottom="1020" w:left="1134" w:header="720" w:footer="720" w:gutter="0"/>
       <w:cols w:space="720"/>
       <w:docGrid w:linePitch="360"/>
     </w:sectPr>

</xml_diff>